<commit_message>
Added some files in Object Oriented Programming, Occupational Health and Sciences
</commit_message>
<xml_diff>
--- a/Object Oriented Programming/Object Oriented Programming Lab (CSL-210)/Task List.docx
+++ b/Object Oriented Programming/Object Oriented Programming Lab (CSL-210)/Task List.docx
@@ -208,7 +208,7 @@
                                 <w:sz w:val="26"/>
                                 <w:szCs w:val="26"/>
                               </w:rPr>
-                              <w:t>1</w:t>
+                              <w:t>2</w:t>
                             </w:r>
                           </w:p>
                         </w:txbxContent>
@@ -262,7 +262,7 @@
                           <w:sz w:val="26"/>
                           <w:szCs w:val="26"/>
                         </w:rPr>
-                        <w:t>1</w:t>
+                        <w:t>2</w:t>
                       </w:r>
                     </w:p>
                   </w:txbxContent>
@@ -452,7 +452,7 @@
       </w:tr>
       <w:tr>
         <w:trPr>
-          <w:trHeight w:hRule="exact" w:val="360"/>
+          <w:trHeight w:hRule="exact" w:val="659"/>
         </w:trPr>
         <w:tc>
           <w:tcPr>
@@ -514,25 +514,25 @@
                 <w:sz w:val="26"/>
                 <w:szCs w:val="26"/>
               </w:rPr>
-              <w:t>Write a program that prints a mosque,</w:t>
-            </w:r>
-            <w:r>
-              <w:rPr>
-                <w:rFonts w:ascii="Times New Roman" w:hAnsi="Times New Roman" w:cs="Times New Roman"/>
-                <w:color w:val="000000" w:themeColor="text1"/>
-                <w:sz w:val="26"/>
-                <w:szCs w:val="26"/>
-              </w:rPr>
-              <w:t xml:space="preserve"> by using J</w:t>
-            </w:r>
-            <w:r>
-              <w:rPr>
-                <w:rFonts w:ascii="Times New Roman" w:hAnsi="Times New Roman" w:cs="Times New Roman"/>
-                <w:color w:val="000000" w:themeColor="text1"/>
-                <w:sz w:val="26"/>
-                <w:szCs w:val="26"/>
-              </w:rPr>
-              <w:t>AVA</w:t>
+              <w:t>Create a class student which contains the basic data about the student</w:t>
+            </w:r>
+            <w:r>
+              <w:rPr>
+                <w:rFonts w:ascii="Times New Roman" w:hAnsi="Times New Roman" w:cs="Times New Roman"/>
+                <w:color w:val="000000" w:themeColor="text1"/>
+                <w:sz w:val="26"/>
+                <w:szCs w:val="26"/>
+              </w:rPr>
+              <w:t xml:space="preserve"> and ask the student if he/she want to update</w:t>
+            </w:r>
+            <w:r>
+              <w:rPr>
+                <w:rFonts w:ascii="Times New Roman" w:hAnsi="Times New Roman" w:cs="Times New Roman"/>
+                <w:color w:val="000000" w:themeColor="text1"/>
+                <w:sz w:val="26"/>
+                <w:szCs w:val="26"/>
+              </w:rPr>
+              <w:t xml:space="preserve"> and display the updated data</w:t>
             </w:r>
             <w:r>
               <w:rPr>
@@ -548,7 +548,7 @@
       </w:tr>
       <w:tr>
         <w:trPr>
-          <w:trHeight w:hRule="exact" w:val="1352"/>
+          <w:trHeight w:hRule="exact" w:val="722"/>
         </w:trPr>
         <w:tc>
           <w:tcPr>
@@ -614,25 +614,7 @@
                 <w:sz w:val="26"/>
                 <w:szCs w:val="26"/>
               </w:rPr>
-              <w:t>Write a JAVA program, which receives the input of two integer numbers, operation (</w:t>
-            </w:r>
-            <w:r>
-              <w:rPr>
-                <w:rFonts w:ascii="Times New Roman" w:hAnsi="Times New Roman" w:cs="Times New Roman"/>
-                <w:color w:val="000000" w:themeColor="text1"/>
-                <w:sz w:val="26"/>
-                <w:szCs w:val="26"/>
-              </w:rPr>
-              <w:t>+, -, *</w:t>
-            </w:r>
-            <w:r>
-              <w:rPr>
-                <w:rFonts w:ascii="Times New Roman" w:hAnsi="Times New Roman" w:cs="Times New Roman"/>
-                <w:color w:val="000000" w:themeColor="text1"/>
-                <w:sz w:val="26"/>
-                <w:szCs w:val="26"/>
-              </w:rPr>
-              <w:t>,</w:t>
+              <w:t>Create a class “computer” which contains specifications of computer</w:t>
             </w:r>
             <w:r>
               <w:rPr>
@@ -650,7 +632,7 @@
                 <w:sz w:val="26"/>
                 <w:szCs w:val="26"/>
               </w:rPr>
-              <w:t>/,</w:t>
+              <w:t>and ask the student if he/she want to update</w:t>
             </w:r>
             <w:r>
               <w:rPr>
@@ -668,43 +650,16 @@
                 <w:sz w:val="26"/>
                 <w:szCs w:val="26"/>
               </w:rPr>
-              <w:t>%, power, square-</w:t>
-            </w:r>
-            <w:r>
-              <w:rPr>
-                <w:rFonts w:ascii="Times New Roman" w:hAnsi="Times New Roman" w:cs="Times New Roman"/>
-                <w:color w:val="000000" w:themeColor="text1"/>
-                <w:sz w:val="26"/>
-                <w:szCs w:val="26"/>
-              </w:rPr>
-              <w:t>root,</w:t>
-            </w:r>
-            <w:r>
-              <w:rPr>
-                <w:rFonts w:ascii="Times New Roman" w:hAnsi="Times New Roman" w:cs="Times New Roman"/>
-                <w:color w:val="000000" w:themeColor="text1"/>
-                <w:sz w:val="26"/>
-                <w:szCs w:val="26"/>
-              </w:rPr>
-              <w:t xml:space="preserve"> and factorial) and compute </w:t>
-            </w:r>
-            <w:r>
-              <w:rPr>
-                <w:rFonts w:ascii="Times New Roman" w:hAnsi="Times New Roman" w:cs="Times New Roman"/>
-                <w:color w:val="000000" w:themeColor="text1"/>
-                <w:sz w:val="26"/>
-                <w:szCs w:val="26"/>
-              </w:rPr>
-              <w:t>arithmetic</w:t>
-            </w:r>
-            <w:r>
-              <w:rPr>
-                <w:rFonts w:ascii="Times New Roman" w:hAnsi="Times New Roman" w:cs="Times New Roman"/>
-                <w:color w:val="000000" w:themeColor="text1"/>
-                <w:sz w:val="26"/>
-                <w:szCs w:val="26"/>
-              </w:rPr>
-              <w:t xml:space="preserve"> operations. Generate a menu for operations and ask user after every operation if they want to do another.</w:t>
+              <w:t>and display the updated data</w:t>
+            </w:r>
+            <w:r>
+              <w:rPr>
+                <w:rFonts w:ascii="Times New Roman" w:hAnsi="Times New Roman" w:cs="Times New Roman"/>
+                <w:color w:val="000000" w:themeColor="text1"/>
+                <w:sz w:val="26"/>
+                <w:szCs w:val="26"/>
+              </w:rPr>
+              <w:t>.</w:t>
             </w:r>
           </w:p>
         </w:tc>
@@ -760,6 +715,7 @@
           <w:p>
             <w:pPr>
               <w:pStyle w:val="TableParagraph"/>
+              <w:jc w:val="both"/>
               <w:rPr>
                 <w:rFonts w:ascii="Times New Roman" w:hAnsi="Times New Roman" w:cs="Times New Roman"/>
                 <w:color w:val="000000" w:themeColor="text1"/>
@@ -774,7 +730,7 @@
                 <w:sz w:val="26"/>
                 <w:szCs w:val="26"/>
               </w:rPr>
-              <w:t>Make a program in JAVA</w:t>
+              <w:t>Create a class of Employee which contains basic information about an employee</w:t>
             </w:r>
             <w:r>
               <w:rPr>
@@ -792,16 +748,79 @@
                 <w:sz w:val="26"/>
                 <w:szCs w:val="26"/>
               </w:rPr>
-              <w:t>which take</w:t>
-            </w:r>
-            <w:r>
-              <w:rPr>
-                <w:rFonts w:ascii="Times New Roman" w:hAnsi="Times New Roman" w:cs="Times New Roman"/>
-                <w:color w:val="000000" w:themeColor="text1"/>
-                <w:sz w:val="26"/>
-                <w:szCs w:val="26"/>
-              </w:rPr>
-              <w:t>s</w:t>
+              <w:t>i.e.,</w:t>
+            </w:r>
+            <w:r>
+              <w:rPr>
+                <w:rFonts w:ascii="Times New Roman" w:hAnsi="Times New Roman" w:cs="Times New Roman"/>
+                <w:color w:val="000000" w:themeColor="text1"/>
+                <w:sz w:val="26"/>
+                <w:szCs w:val="26"/>
+              </w:rPr>
+              <w:t xml:space="preserve"> Employee</w:t>
+            </w:r>
+            <w:r>
+              <w:rPr>
+                <w:rFonts w:ascii="Times New Roman" w:hAnsi="Times New Roman" w:cs="Times New Roman"/>
+                <w:color w:val="000000" w:themeColor="text1"/>
+                <w:sz w:val="26"/>
+                <w:szCs w:val="26"/>
+              </w:rPr>
+              <w:t xml:space="preserve"> name, father’s </w:t>
+            </w:r>
+            <w:r>
+              <w:rPr>
+                <w:rFonts w:ascii="Times New Roman" w:hAnsi="Times New Roman" w:cs="Times New Roman"/>
+                <w:color w:val="000000" w:themeColor="text1"/>
+                <w:sz w:val="26"/>
+                <w:szCs w:val="26"/>
+              </w:rPr>
+              <w:t>name,</w:t>
+            </w:r>
+            <w:r>
+              <w:rPr>
+                <w:rFonts w:ascii="Times New Roman" w:hAnsi="Times New Roman" w:cs="Times New Roman"/>
+                <w:color w:val="000000" w:themeColor="text1"/>
+                <w:sz w:val="26"/>
+                <w:szCs w:val="26"/>
+              </w:rPr>
+              <w:t xml:space="preserve"> and salary</w:t>
+            </w:r>
+            <w:r>
+              <w:rPr>
+                <w:rFonts w:ascii="Times New Roman" w:hAnsi="Times New Roman" w:cs="Times New Roman"/>
+                <w:color w:val="000000" w:themeColor="text1"/>
+                <w:sz w:val="26"/>
+                <w:szCs w:val="26"/>
+              </w:rPr>
+              <w:t>. T</w:t>
+            </w:r>
+            <w:r>
+              <w:rPr>
+                <w:rFonts w:ascii="Times New Roman" w:hAnsi="Times New Roman" w:cs="Times New Roman"/>
+                <w:color w:val="000000" w:themeColor="text1"/>
+                <w:sz w:val="26"/>
+                <w:szCs w:val="26"/>
+              </w:rPr>
+              <w:t xml:space="preserve">he salary of employees or the </w:t>
+            </w:r>
+            <w:r>
+              <w:rPr>
+                <w:rFonts w:ascii="Times New Roman" w:hAnsi="Times New Roman" w:cs="Times New Roman"/>
+                <w:color w:val="000000" w:themeColor="text1"/>
+                <w:sz w:val="26"/>
+                <w:szCs w:val="26"/>
+              </w:rPr>
+              <w:t>designation of</w:t>
+            </w:r>
+            <w:r>
+              <w:rPr>
+                <w:rFonts w:ascii="Times New Roman" w:hAnsi="Times New Roman" w:cs="Times New Roman"/>
+                <w:color w:val="000000" w:themeColor="text1"/>
+                <w:sz w:val="26"/>
+                <w:szCs w:val="26"/>
+              </w:rPr>
+              <w:t xml:space="preserve"> the employees are being set/updated as per need</w:t>
             </w:r>
             <w:r>
               <w:rPr>
@@ -819,43 +838,7 @@
                 <w:sz w:val="26"/>
                 <w:szCs w:val="26"/>
               </w:rPr>
-              <w:t xml:space="preserve">number </w:t>
-            </w:r>
-            <w:r>
-              <w:rPr>
-                <w:rFonts w:ascii="Times New Roman" w:hAnsi="Times New Roman" w:cs="Times New Roman"/>
-                <w:color w:val="000000" w:themeColor="text1"/>
-                <w:sz w:val="26"/>
-                <w:szCs w:val="26"/>
-              </w:rPr>
-              <w:t xml:space="preserve">of items, price of items and name of items as input from the user and give the discount according to </w:t>
-            </w:r>
-            <w:r>
-              <w:rPr>
-                <w:rFonts w:ascii="Times New Roman" w:hAnsi="Times New Roman" w:cs="Times New Roman"/>
-                <w:color w:val="000000" w:themeColor="text1"/>
-                <w:sz w:val="26"/>
-                <w:szCs w:val="26"/>
-              </w:rPr>
-              <w:t xml:space="preserve">some </w:t>
-            </w:r>
-            <w:r>
-              <w:rPr>
-                <w:rFonts w:ascii="Times New Roman" w:hAnsi="Times New Roman" w:cs="Times New Roman"/>
-                <w:color w:val="000000" w:themeColor="text1"/>
-                <w:sz w:val="26"/>
-                <w:szCs w:val="26"/>
-              </w:rPr>
-              <w:t>given</w:t>
-            </w:r>
-            <w:r>
-              <w:rPr>
-                <w:rFonts w:ascii="Times New Roman" w:hAnsi="Times New Roman" w:cs="Times New Roman"/>
-                <w:color w:val="000000" w:themeColor="text1"/>
-                <w:sz w:val="26"/>
-                <w:szCs w:val="26"/>
-              </w:rPr>
-              <w:t xml:space="preserve"> conditions</w:t>
+              <w:t>and display the updated data</w:t>
             </w:r>
             <w:r>
               <w:rPr>
@@ -866,22 +849,12 @@
               </w:rPr>
               <w:t>.</w:t>
             </w:r>
-          </w:p>
-          <w:p>
-            <w:pPr>
-              <w:rPr>
-                <w:rFonts w:ascii="Times New Roman" w:hAnsi="Times New Roman" w:cs="Times New Roman"/>
-                <w:color w:val="000000" w:themeColor="text1"/>
-                <w:sz w:val="26"/>
-                <w:szCs w:val="26"/>
-              </w:rPr>
-            </w:pPr>
           </w:p>
         </w:tc>
       </w:tr>
       <w:tr>
         <w:trPr>
-          <w:trHeight w:hRule="exact" w:val="632"/>
+          <w:trHeight w:hRule="exact" w:val="902"/>
         </w:trPr>
         <w:tc>
           <w:tcPr>
@@ -934,6 +907,7 @@
                 <w:tab w:val="left" w:pos="1253"/>
               </w:tabs>
               <w:ind w:right="90"/>
+              <w:jc w:val="both"/>
               <w:rPr>
                 <w:rFonts w:ascii="Times New Roman" w:hAnsi="Times New Roman" w:cs="Times New Roman"/>
                 <w:color w:val="000000" w:themeColor="text1"/>
@@ -948,61 +922,34 @@
                 <w:sz w:val="26"/>
                 <w:szCs w:val="26"/>
               </w:rPr>
-              <w:t xml:space="preserve">Write a JAVA program which will implement </w:t>
-            </w:r>
-            <w:r>
-              <w:rPr>
-                <w:rFonts w:ascii="Times New Roman" w:hAnsi="Times New Roman" w:cs="Times New Roman"/>
-                <w:color w:val="000000" w:themeColor="text1"/>
-                <w:sz w:val="26"/>
-                <w:szCs w:val="26"/>
-              </w:rPr>
-              <w:t xml:space="preserve">some </w:t>
-            </w:r>
-            <w:r>
-              <w:rPr>
-                <w:rFonts w:ascii="Times New Roman" w:hAnsi="Times New Roman" w:cs="Times New Roman"/>
-                <w:color w:val="000000" w:themeColor="text1"/>
-                <w:sz w:val="26"/>
-                <w:szCs w:val="26"/>
-              </w:rPr>
-              <w:t>formulae</w:t>
-            </w:r>
-            <w:r>
-              <w:rPr>
-                <w:rFonts w:ascii="Times New Roman" w:hAnsi="Times New Roman" w:cs="Times New Roman"/>
-                <w:color w:val="000000" w:themeColor="text1"/>
-                <w:sz w:val="26"/>
-                <w:szCs w:val="26"/>
-              </w:rPr>
-              <w:t xml:space="preserve"> (</w:t>
-            </w:r>
-            <w:r>
-              <w:rPr>
-                <w:rFonts w:ascii="Times New Roman" w:hAnsi="Times New Roman" w:cs="Times New Roman"/>
-                <w:color w:val="000000" w:themeColor="text1"/>
-                <w:sz w:val="26"/>
-                <w:szCs w:val="26"/>
-              </w:rPr>
-              <w:t>P</w:t>
-            </w:r>
-            <w:r>
-              <w:rPr>
-                <w:rFonts w:ascii="Times New Roman" w:hAnsi="Times New Roman" w:cs="Times New Roman"/>
-                <w:color w:val="000000" w:themeColor="text1"/>
-                <w:sz w:val="26"/>
-                <w:szCs w:val="26"/>
-              </w:rPr>
-              <w:t>ressure in psi</w:t>
-            </w:r>
-            <w:r>
-              <w:rPr>
-                <w:rFonts w:ascii="Times New Roman" w:hAnsi="Times New Roman" w:cs="Times New Roman"/>
-                <w:color w:val="000000" w:themeColor="text1"/>
-                <w:sz w:val="26"/>
-                <w:szCs w:val="26"/>
-              </w:rPr>
-              <w:t>,</w:t>
+              <w:t>Create a class of Automobile which contains specifications of a car</w:t>
+            </w:r>
+            <w:r>
+              <w:rPr>
+                <w:rFonts w:ascii="Times New Roman" w:hAnsi="Times New Roman" w:cs="Times New Roman"/>
+                <w:color w:val="000000" w:themeColor="text1"/>
+                <w:sz w:val="26"/>
+                <w:szCs w:val="26"/>
+              </w:rPr>
+              <w:t>.</w:t>
+            </w:r>
+            <w:r>
+              <w:rPr>
+                <w:rFonts w:ascii="Times New Roman" w:hAnsi="Times New Roman" w:cs="Times New Roman"/>
+                <w:color w:val="000000" w:themeColor="text1"/>
+                <w:sz w:val="26"/>
+                <w:szCs w:val="26"/>
+              </w:rPr>
+              <w:t xml:space="preserve"> The specifications would be </w:t>
+            </w:r>
+            <w:r>
+              <w:rPr>
+                <w:rFonts w:ascii="Times New Roman" w:hAnsi="Times New Roman" w:cs="Times New Roman"/>
+                <w:color w:val="000000" w:themeColor="text1"/>
+                <w:sz w:val="26"/>
+                <w:szCs w:val="26"/>
+              </w:rPr>
+              <w:t>updated according to the need of the user</w:t>
             </w:r>
             <w:r>
               <w:rPr>
@@ -1020,27 +967,107 @@
                 <w:sz w:val="26"/>
                 <w:szCs w:val="26"/>
               </w:rPr>
-              <w:t>Pulley</w:t>
-            </w:r>
-            <w:r>
-              <w:rPr>
-                <w:rFonts w:ascii="Times New Roman" w:hAnsi="Times New Roman" w:cs="Times New Roman"/>
-                <w:color w:val="000000" w:themeColor="text1"/>
-                <w:spacing w:val="-1"/>
+              <w:t>and display the updated data</w:t>
+            </w:r>
+            <w:r>
+              <w:rPr>
+                <w:rFonts w:ascii="Times New Roman" w:hAnsi="Times New Roman" w:cs="Times New Roman"/>
+                <w:color w:val="000000" w:themeColor="text1"/>
+                <w:sz w:val="26"/>
+                <w:szCs w:val="26"/>
+              </w:rPr>
+              <w:t>.</w:t>
+            </w:r>
+          </w:p>
+        </w:tc>
+      </w:tr>
+      <w:tr>
+        <w:trPr>
+          <w:trHeight w:hRule="exact" w:val="713"/>
+        </w:trPr>
+        <w:tc>
+          <w:tcPr>
+            <w:tcW w:w="659" w:type="pct"/>
+            <w:tcBorders>
+              <w:top w:val="single" w:sz="8" w:space="0" w:color="000000" w:themeColor="text1"/>
+              <w:left w:val="single" w:sz="8" w:space="0" w:color="000000" w:themeColor="text1"/>
+              <w:bottom w:val="single" w:sz="8" w:space="0" w:color="000000" w:themeColor="text1"/>
+              <w:right w:val="single" w:sz="8" w:space="0" w:color="000000" w:themeColor="text1"/>
+            </w:tcBorders>
+            <w:shd w:val="clear" w:color="auto" w:fill="FFFFFF" w:themeFill="background1"/>
+            <w:noWrap/>
+          </w:tcPr>
+          <w:p>
+            <w:pPr>
+              <w:jc w:val="center"/>
+              <w:rPr>
+                <w:rFonts w:ascii="Times New Roman" w:hAnsi="Times New Roman" w:cs="Times New Roman"/>
+                <w:color w:val="000000" w:themeColor="text1"/>
+                <w:sz w:val="26"/>
+                <w:szCs w:val="26"/>
+              </w:rPr>
+            </w:pPr>
+            <w:r>
+              <w:rPr>
+                <w:rFonts w:ascii="Times New Roman" w:hAnsi="Times New Roman" w:cs="Times New Roman"/>
+                <w:color w:val="000000" w:themeColor="text1"/>
+                <w:sz w:val="26"/>
+                <w:szCs w:val="26"/>
+              </w:rPr>
+              <w:t>05</w:t>
+            </w:r>
+          </w:p>
+        </w:tc>
+        <w:tc>
+          <w:tcPr>
+            <w:tcW w:w="4341" w:type="pct"/>
+            <w:tcBorders>
+              <w:top w:val="single" w:sz="8" w:space="0" w:color="000000" w:themeColor="text1"/>
+              <w:left w:val="single" w:sz="8" w:space="0" w:color="000000" w:themeColor="text1"/>
+              <w:bottom w:val="single" w:sz="8" w:space="0" w:color="000000" w:themeColor="text1"/>
+              <w:right w:val="single" w:sz="8" w:space="0" w:color="000000" w:themeColor="text1"/>
+            </w:tcBorders>
+            <w:shd w:val="clear" w:color="auto" w:fill="FFFFFF" w:themeFill="background1"/>
+          </w:tcPr>
+          <w:p>
+            <w:pPr>
+              <w:pStyle w:val="DecimalAligned"/>
+              <w:rPr>
+                <w:rFonts w:ascii="Times New Roman" w:hAnsi="Times New Roman" w:cs="Times New Roman"/>
+                <w:color w:val="000000" w:themeColor="text1"/>
+                <w:sz w:val="26"/>
+                <w:szCs w:val="26"/>
+              </w:rPr>
+            </w:pPr>
+            <w:r>
+              <w:rPr>
+                <w:rFonts w:ascii="Times New Roman" w:hAnsi="Times New Roman" w:cs="Times New Roman"/>
+                <w:color w:val="000000" w:themeColor="text1"/>
+                <w:sz w:val="26"/>
+                <w:szCs w:val="26"/>
+              </w:rPr>
+              <w:t>Implement a class Car, that has the characteristics</w:t>
+            </w:r>
+            <w:r>
+              <w:rPr>
+                <w:rFonts w:ascii="Times New Roman" w:hAnsi="Times New Roman" w:cs="Times New Roman"/>
+                <w:color w:val="000000" w:themeColor="text1"/>
                 <w:sz w:val="26"/>
                 <w:szCs w:val="26"/>
               </w:rPr>
               <w:t xml:space="preserve"> </w:t>
             </w:r>
-            <w:r>
-              <w:rPr>
-                <w:rFonts w:ascii="Times New Roman" w:hAnsi="Times New Roman" w:cs="Times New Roman"/>
-                <w:color w:val="000000" w:themeColor="text1"/>
-                <w:sz w:val="26"/>
-                <w:szCs w:val="26"/>
-              </w:rPr>
-              <w:t>formulas</w:t>
-            </w:r>
+            <w:proofErr w:type="spellStart"/>
+            <w:r>
+              <w:rPr>
+                <w:rFonts w:ascii="Times New Roman" w:hAnsi="Times New Roman" w:cs="Times New Roman"/>
+                <w:color w:val="000000" w:themeColor="text1"/>
+                <w:sz w:val="26"/>
+                <w:szCs w:val="26"/>
+              </w:rPr>
+              <w:t>Brandname</w:t>
+            </w:r>
+            <w:proofErr w:type="spellEnd"/>
             <w:r>
               <w:rPr>
                 <w:rFonts w:ascii="Times New Roman" w:hAnsi="Times New Roman" w:cs="Times New Roman"/>
@@ -1050,104 +1077,61 @@
               </w:rPr>
               <w:t xml:space="preserve">, </w:t>
             </w:r>
-            <w:r>
-              <w:rPr>
-                <w:rFonts w:ascii="Times New Roman" w:hAnsi="Times New Roman" w:cs="Times New Roman"/>
-                <w:color w:val="000000" w:themeColor="text1"/>
-                <w:sz w:val="26"/>
-                <w:szCs w:val="26"/>
-              </w:rPr>
-              <w:t>B</w:t>
-            </w:r>
-            <w:r>
-              <w:rPr>
-                <w:rFonts w:ascii="Times New Roman" w:hAnsi="Times New Roman" w:cs="Times New Roman"/>
-                <w:color w:val="000000" w:themeColor="text1"/>
-                <w:sz w:val="26"/>
-                <w:szCs w:val="26"/>
-              </w:rPr>
-              <w:t xml:space="preserve">ody </w:t>
-            </w:r>
-            <w:r>
-              <w:rPr>
-                <w:rFonts w:ascii="Times New Roman" w:hAnsi="Times New Roman" w:cs="Times New Roman"/>
-                <w:color w:val="000000" w:themeColor="text1"/>
-                <w:sz w:val="26"/>
-                <w:szCs w:val="26"/>
-              </w:rPr>
-              <w:t>M</w:t>
-            </w:r>
-            <w:r>
-              <w:rPr>
-                <w:rFonts w:ascii="Times New Roman" w:hAnsi="Times New Roman" w:cs="Times New Roman"/>
-                <w:color w:val="000000" w:themeColor="text1"/>
-                <w:sz w:val="26"/>
-                <w:szCs w:val="26"/>
-              </w:rPr>
-              <w:t xml:space="preserve">ass </w:t>
-            </w:r>
-            <w:r>
-              <w:rPr>
-                <w:rFonts w:ascii="Times New Roman" w:hAnsi="Times New Roman" w:cs="Times New Roman"/>
-                <w:color w:val="000000" w:themeColor="text1"/>
-                <w:sz w:val="26"/>
-                <w:szCs w:val="26"/>
-              </w:rPr>
-              <w:t>I</w:t>
-            </w:r>
-            <w:r>
-              <w:rPr>
-                <w:rFonts w:ascii="Times New Roman" w:hAnsi="Times New Roman" w:cs="Times New Roman"/>
-                <w:color w:val="000000" w:themeColor="text1"/>
-                <w:sz w:val="26"/>
-                <w:szCs w:val="26"/>
-              </w:rPr>
-              <w:t>ndex</w:t>
-            </w:r>
-            <w:r>
-              <w:rPr>
-                <w:rFonts w:ascii="Times New Roman" w:hAnsi="Times New Roman" w:cs="Times New Roman"/>
-                <w:color w:val="000000" w:themeColor="text1"/>
-                <w:sz w:val="26"/>
-                <w:szCs w:val="26"/>
-              </w:rPr>
-              <w:t>)</w:t>
-            </w:r>
-            <w:r>
-              <w:rPr>
-                <w:rFonts w:ascii="Times New Roman" w:hAnsi="Times New Roman" w:cs="Times New Roman"/>
-                <w:color w:val="000000" w:themeColor="text1"/>
-                <w:sz w:val="26"/>
-                <w:szCs w:val="26"/>
-              </w:rPr>
-              <w:t xml:space="preserve"> using </w:t>
-            </w:r>
-            <w:r>
-              <w:rPr>
-                <w:rFonts w:ascii="Times New Roman" w:hAnsi="Times New Roman" w:cs="Times New Roman"/>
-                <w:color w:val="000000" w:themeColor="text1"/>
-                <w:sz w:val="26"/>
-                <w:szCs w:val="26"/>
-              </w:rPr>
-              <w:t>M</w:t>
-            </w:r>
-            <w:r>
-              <w:rPr>
-                <w:rFonts w:ascii="Times New Roman" w:hAnsi="Times New Roman" w:cs="Times New Roman"/>
-                <w:color w:val="000000" w:themeColor="text1"/>
-                <w:sz w:val="26"/>
-                <w:szCs w:val="26"/>
-              </w:rPr>
-              <w:t>eth</w:t>
-            </w:r>
-            <w:r>
-              <w:rPr>
-                <w:rFonts w:ascii="Times New Roman" w:hAnsi="Times New Roman" w:cs="Times New Roman"/>
-                <w:color w:val="000000" w:themeColor="text1"/>
-                <w:sz w:val="26"/>
-                <w:szCs w:val="26"/>
-              </w:rPr>
-              <w:t>ods</w:t>
+            <w:proofErr w:type="spellStart"/>
+            <w:r>
+              <w:rPr>
+                <w:rFonts w:ascii="Times New Roman" w:hAnsi="Times New Roman" w:cs="Times New Roman"/>
+                <w:color w:val="000000" w:themeColor="text1"/>
+                <w:sz w:val="26"/>
+                <w:szCs w:val="26"/>
+              </w:rPr>
+              <w:t>PriceNew</w:t>
+            </w:r>
+            <w:proofErr w:type="spellEnd"/>
+            <w:r>
+              <w:rPr>
+                <w:rFonts w:ascii="Times New Roman" w:hAnsi="Times New Roman" w:cs="Times New Roman"/>
+                <w:color w:val="000000" w:themeColor="text1"/>
+                <w:sz w:val="26"/>
+                <w:szCs w:val="26"/>
+              </w:rPr>
+              <w:t xml:space="preserve">, </w:t>
+            </w:r>
+            <w:r>
+              <w:rPr>
+                <w:rFonts w:ascii="Times New Roman" w:hAnsi="Times New Roman" w:cs="Times New Roman"/>
+                <w:color w:val="000000" w:themeColor="text1"/>
+                <w:sz w:val="26"/>
+                <w:szCs w:val="26"/>
+              </w:rPr>
+              <w:t>Color and Odometer</w:t>
+            </w:r>
+            <w:r>
+              <w:rPr>
+                <w:rFonts w:ascii="Times New Roman" w:hAnsi="Times New Roman" w:cs="Times New Roman"/>
+                <w:color w:val="000000" w:themeColor="text1"/>
+                <w:sz w:val="26"/>
+                <w:szCs w:val="26"/>
+              </w:rPr>
+              <w:t xml:space="preserve"> and </w:t>
+            </w:r>
+            <w:r>
+              <w:rPr>
+                <w:rFonts w:ascii="Times New Roman" w:hAnsi="Times New Roman" w:cs="Times New Roman"/>
+                <w:color w:val="000000" w:themeColor="text1"/>
+                <w:sz w:val="26"/>
+                <w:szCs w:val="26"/>
+              </w:rPr>
+              <w:t>return the price of car after being used according to</w:t>
+            </w:r>
+            <w:r>
+              <w:rPr>
+                <w:rFonts w:ascii="Times New Roman" w:hAnsi="Times New Roman" w:cs="Times New Roman"/>
+                <w:color w:val="000000" w:themeColor="text1"/>
+                <w:sz w:val="26"/>
+                <w:szCs w:val="26"/>
+              </w:rPr>
+              <w:t xml:space="preserve"> given formula</w:t>
             </w:r>
             <w:r>
               <w:rPr>
@@ -1164,7 +1148,7 @@
       <w:tr>
         <w:trPr>
           <w:cnfStyle w:val="010000000000" w:firstRow="0" w:lastRow="1" w:firstColumn="0" w:lastColumn="0" w:oddVBand="0" w:evenVBand="0" w:oddHBand="0" w:evenHBand="0" w:firstRowFirstColumn="0" w:firstRowLastColumn="0" w:lastRowFirstColumn="0" w:lastRowLastColumn="0"/>
-          <w:trHeight w:hRule="exact" w:val="360"/>
+          <w:trHeight w:hRule="exact" w:val="452"/>
         </w:trPr>
         <w:tc>
           <w:tcPr>
@@ -1228,17 +1212,6 @@
     <w:p>
       <w:pPr>
         <w:pStyle w:val="NoSpacing"/>
-        <w:rPr>
-          <w:rFonts w:ascii="Britannic Bold" w:hAnsi="Britannic Bold"/>
-          <w:color w:val="000000" w:themeColor="text1"/>
-          <w:sz w:val="36"/>
-          <w:szCs w:val="36"/>
-        </w:rPr>
-      </w:pPr>
-    </w:p>
-    <w:p>
-      <w:pPr>
-        <w:pStyle w:val="NoSpacing"/>
         <w:jc w:val="center"/>
         <w:rPr>
           <w:rFonts w:ascii="Britannic Bold" w:hAnsi="Britannic Bold"/>
@@ -1279,13 +1252,13 @@
         <mc:AlternateContent>
           <mc:Choice Requires="wps">
             <w:drawing>
-              <wp:anchor distT="0" distB="0" distL="114300" distR="114300" simplePos="0" relativeHeight="251660288" behindDoc="0" locked="0" layoutInCell="1" allowOverlap="1" wp14:anchorId="5309ADD1" wp14:editId="3DB3C6B8">
+              <wp:anchor distT="0" distB="0" distL="114300" distR="114300" simplePos="0" relativeHeight="251660288" behindDoc="0" locked="0" layoutInCell="1" allowOverlap="1" wp14:anchorId="5309ADD1" wp14:editId="2C767E3C">
                 <wp:simplePos x="0" y="0"/>
                 <wp:positionH relativeFrom="column">
-                  <wp:posOffset>2546350</wp:posOffset>
+                  <wp:posOffset>2387600</wp:posOffset>
                 </wp:positionH>
                 <wp:positionV relativeFrom="paragraph">
-                  <wp:posOffset>8890</wp:posOffset>
+                  <wp:posOffset>2540</wp:posOffset>
                 </wp:positionV>
                 <wp:extent cx="1225550" cy="254000"/>
                 <wp:effectExtent l="0" t="0" r="0" b="0"/>
@@ -1322,13 +1295,25 @@
                               <w:rPr>
                                 <w:rFonts w:ascii="Britannic Bold" w:hAnsi="Britannic Bold"/>
                               </w:rPr>
+                              <w:t>07</w:t>
+                            </w:r>
+                            <w:r>
+                              <w:rPr>
+                                <w:rFonts w:ascii="Britannic Bold" w:hAnsi="Britannic Bold"/>
+                              </w:rPr>
                               <w:t>/</w:t>
                             </w:r>
                             <w:r>
                               <w:rPr>
                                 <w:rFonts w:ascii="Britannic Bold" w:hAnsi="Britannic Bold"/>
                               </w:rPr>
-                              <w:t>02</w:t>
+                              <w:t>0</w:t>
+                            </w:r>
+                            <w:r>
+                              <w:rPr>
+                                <w:rFonts w:ascii="Britannic Bold" w:hAnsi="Britannic Bold"/>
+                              </w:rPr>
+                              <w:t>3</w:t>
                             </w:r>
                             <w:r>
                               <w:rPr>
@@ -1359,7 +1344,7 @@
           </mc:Choice>
           <mc:Fallback>
             <w:pict>
-              <v:shape w14:anchorId="5309ADD1" id="Text Box 4" o:spid="_x0000_s1027" type="#_x0000_t202" style="position:absolute;left:0;text-align:left;margin-left:200.5pt;margin-top:.7pt;width:96.5pt;height:20pt;z-index:251660288;visibility:visible;mso-wrap-style:square;mso-wrap-distance-left:9pt;mso-wrap-distance-top:0;mso-wrap-distance-right:9pt;mso-wrap-distance-bottom:0;mso-position-horizontal:absolute;mso-position-horizontal-relative:text;mso-position-vertical:absolute;mso-position-vertical-relative:text;v-text-anchor:top" o:gfxdata="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" filled="f" stroked="f" strokeweight=".5pt">
+              <v:shape w14:anchorId="5309ADD1" id="Text Box 4" o:spid="_x0000_s1027" type="#_x0000_t202" style="position:absolute;left:0;text-align:left;margin-left:188pt;margin-top:.2pt;width:96.5pt;height:20pt;z-index:251660288;visibility:visible;mso-wrap-style:square;mso-wrap-distance-left:9pt;mso-wrap-distance-top:0;mso-wrap-distance-right:9pt;mso-wrap-distance-bottom:0;mso-position-horizontal:absolute;mso-position-horizontal-relative:text;mso-position-vertical:absolute;mso-position-vertical-relative:text;v-text-anchor:top" o:gfxdata="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" filled="f" stroked="f" strokeweight=".5pt">
                 <v:textbox>
                   <w:txbxContent>
                     <w:p>
@@ -1373,13 +1358,25 @@
                         <w:rPr>
                           <w:rFonts w:ascii="Britannic Bold" w:hAnsi="Britannic Bold"/>
                         </w:rPr>
+                        <w:t>07</w:t>
+                      </w:r>
+                      <w:r>
+                        <w:rPr>
+                          <w:rFonts w:ascii="Britannic Bold" w:hAnsi="Britannic Bold"/>
+                        </w:rPr>
                         <w:t>/</w:t>
                       </w:r>
                       <w:r>
                         <w:rPr>
                           <w:rFonts w:ascii="Britannic Bold" w:hAnsi="Britannic Bold"/>
                         </w:rPr>
-                        <w:t>02</w:t>
+                        <w:t>0</w:t>
+                      </w:r>
+                      <w:r>
+                        <w:rPr>
+                          <w:rFonts w:ascii="Britannic Bold" w:hAnsi="Britannic Bold"/>
+                        </w:rPr>
+                        <w:t>3</w:t>
                       </w:r>
                       <w:r>
                         <w:rPr>
@@ -1440,6 +1437,7 @@
     </w:p>
     <w:p>
       <w:pPr>
+        <w:spacing w:after="0"/>
         <w:jc w:val="center"/>
         <w:rPr>
           <w:color w:val="000000" w:themeColor="text1"/>

</xml_diff>